<commit_message>
Created IMT, WOC and added some files
</commit_message>
<xml_diff>
--- a/Edu_Research/Appl Form Template_Nov30 2021.docx
+++ b/Edu_Research/Appl Form Template_Nov30 2021.docx
@@ -1,6 +1,6 @@
 
 <file path=word/document.xml><?xml version="1.0" encoding="utf-8"?>
-<w:document xmlns:wpc="http://schemas.microsoft.com/office/word/2010/wordprocessingCanvas" xmlns:cx="http://schemas.microsoft.com/office/drawing/2014/chartex" xmlns:cx1="http://schemas.microsoft.com/office/drawing/2015/9/8/chartex" xmlns:cx2="http://schemas.microsoft.com/office/drawing/2015/10/21/chartex" xmlns:cx3="http://schemas.microsoft.com/office/drawing/2016/5/9/chartex" xmlns:cx4="http://schemas.microsoft.com/office/drawing/2016/5/10/chartex" xmlns:cx5="http://schemas.microsoft.com/office/drawing/2016/5/11/chartex" xmlns:cx6="http://schemas.microsoft.com/office/drawing/2016/5/12/chartex" xmlns:cx7="http://schemas.microsoft.com/office/drawing/2016/5/13/chartex" xmlns:cx8="http://schemas.microsoft.com/office/drawing/2016/5/14/chartex" xmlns:mc="http://schemas.openxmlformats.org/markup-compatibility/2006" xmlns:aink="http://schemas.microsoft.com/office/drawing/2016/ink" xmlns:am3d="http://schemas.microsoft.com/office/drawing/2017/model3d" xmlns:o="urn:schemas-microsoft-com:office:office" xmlns:r="http://schemas.openxmlformats.org/officeDocument/2006/relationships" xmlns:m="http://schemas.openxmlformats.org/officeDocument/2006/math" xmlns:v="urn:schemas-microsoft-com:vml" xmlns:wp14="http://schemas.microsoft.com/office/word/2010/wordprocessingDrawing" xmlns:wp="http://schemas.openxmlformats.org/drawingml/2006/wordprocessingDrawing" xmlns:w10="urn:schemas-microsoft-com:office:word" xmlns:w="http://schemas.openxmlformats.org/wordprocessingml/2006/main" xmlns:w14="http://schemas.microsoft.com/office/word/2010/wordml" xmlns:w15="http://schemas.microsoft.com/office/word/2012/wordml" xmlns:w16cex="http://schemas.microsoft.com/office/word/2018/wordml/cex" xmlns:w16cid="http://schemas.microsoft.com/office/word/2016/wordml/cid" xmlns:w16="http://schemas.microsoft.com/office/word/2018/wordml" xmlns:w16se="http://schemas.microsoft.com/office/word/2015/wordml/symex" xmlns:wpg="http://schemas.microsoft.com/office/word/2010/wordprocessingGroup" xmlns:wpi="http://schemas.microsoft.com/office/word/2010/wordprocessingInk" xmlns:wne="http://schemas.microsoft.com/office/word/2006/wordml" xmlns:wps="http://schemas.microsoft.com/office/word/2010/wordprocessingShape" mc:Ignorable="w14 w15 w16se w16cid w16 w16cex wp14">
+<w:document xmlns:wpc="http://schemas.microsoft.com/office/word/2010/wordprocessingCanvas" xmlns:cx="http://schemas.microsoft.com/office/drawing/2014/chartex" xmlns:cx1="http://schemas.microsoft.com/office/drawing/2015/9/8/chartex" xmlns:cx2="http://schemas.microsoft.com/office/drawing/2015/10/21/chartex" xmlns:cx3="http://schemas.microsoft.com/office/drawing/2016/5/9/chartex" xmlns:cx4="http://schemas.microsoft.com/office/drawing/2016/5/10/chartex" xmlns:cx5="http://schemas.microsoft.com/office/drawing/2016/5/11/chartex" xmlns:cx6="http://schemas.microsoft.com/office/drawing/2016/5/12/chartex" xmlns:cx7="http://schemas.microsoft.com/office/drawing/2016/5/13/chartex" xmlns:cx8="http://schemas.microsoft.com/office/drawing/2016/5/14/chartex" xmlns:mc="http://schemas.openxmlformats.org/markup-compatibility/2006" xmlns:aink="http://schemas.microsoft.com/office/drawing/2016/ink" xmlns:am3d="http://schemas.microsoft.com/office/drawing/2017/model3d" xmlns:o="urn:schemas-microsoft-com:office:office" xmlns:oel="http://schemas.microsoft.com/office/2019/extlst" xmlns:r="http://schemas.openxmlformats.org/officeDocument/2006/relationships" xmlns:m="http://schemas.openxmlformats.org/officeDocument/2006/math" xmlns:v="urn:schemas-microsoft-com:vml" xmlns:wp14="http://schemas.microsoft.com/office/word/2010/wordprocessingDrawing" xmlns:wp="http://schemas.openxmlformats.org/drawingml/2006/wordprocessingDrawing" xmlns:w10="urn:schemas-microsoft-com:office:word" xmlns:w="http://schemas.openxmlformats.org/wordprocessingml/2006/main" xmlns:w14="http://schemas.microsoft.com/office/word/2010/wordml" xmlns:w15="http://schemas.microsoft.com/office/word/2012/wordml" xmlns:w16cex="http://schemas.microsoft.com/office/word/2018/wordml/cex" xmlns:w16cid="http://schemas.microsoft.com/office/word/2016/wordml/cid" xmlns:w16="http://schemas.microsoft.com/office/word/2018/wordml" xmlns:w16sdtdh="http://schemas.microsoft.com/office/word/2020/wordml/sdtdatahash" xmlns:w16se="http://schemas.microsoft.com/office/word/2015/wordml/symex" xmlns:wpg="http://schemas.microsoft.com/office/word/2010/wordprocessingGroup" xmlns:wpi="http://schemas.microsoft.com/office/word/2010/wordprocessingInk" xmlns:wne="http://schemas.microsoft.com/office/word/2006/wordml" xmlns:wps="http://schemas.microsoft.com/office/word/2010/wordprocessingShape" mc:Ignorable="w14 w15 w16se w16cid w16 w16cex w16sdtdh wp14">
   <w:body>
     <w:p>
       <w:pPr>
@@ -109,11 +109,54 @@
             <w:pPr>
               <w:pStyle w:val="NormalWeb"/>
               <w:spacing w:before="240" w:beforeAutospacing="0" w:after="0" w:afterAutospacing="0" w:line="276" w:lineRule="auto"/>
-              <w:rPr>
-                <w:rFonts w:ascii="Gill Sans MT" w:hAnsi="Gill Sans MT"/>
-                <w:b/>
+              <w:jc w:val="center"/>
+              <w:rPr>
+                <w:rFonts w:ascii="Gill Sans MT" w:hAnsi="Gill Sans MT"/>
+                <w:bCs/>
               </w:rPr>
             </w:pPr>
+            <w:r>
+              <w:rPr>
+                <w:rFonts w:ascii="Gill Sans MT" w:hAnsi="Gill Sans MT"/>
+                <w:bCs/>
+              </w:rPr>
+              <w:t xml:space="preserve">Integration of Inquiry </w:t>
+            </w:r>
+            <w:r>
+              <w:rPr>
+                <w:rFonts w:ascii="Gill Sans MT" w:hAnsi="Gill Sans MT"/>
+                <w:bCs/>
+              </w:rPr>
+              <w:t>B</w:t>
+            </w:r>
+            <w:r>
+              <w:rPr>
+                <w:rFonts w:ascii="Gill Sans MT" w:hAnsi="Gill Sans MT"/>
+                <w:bCs/>
+              </w:rPr>
+              <w:t xml:space="preserve">ased </w:t>
+            </w:r>
+            <w:r>
+              <w:rPr>
+                <w:rFonts w:ascii="Gill Sans MT" w:hAnsi="Gill Sans MT"/>
+                <w:bCs/>
+              </w:rPr>
+              <w:t>L</w:t>
+            </w:r>
+            <w:r>
+              <w:rPr>
+                <w:rFonts w:ascii="Gill Sans MT" w:hAnsi="Gill Sans MT"/>
+                <w:bCs/>
+              </w:rPr>
+              <w:t>earning</w:t>
+            </w:r>
+            <w:r>
+              <w:rPr>
+                <w:rFonts w:ascii="Gill Sans MT" w:hAnsi="Gill Sans MT"/>
+                <w:bCs/>
+              </w:rPr>
+              <w:t xml:space="preserve"> with the History of Mathematics in Teaching Number Theory</w:t>
+            </w:r>
           </w:p>
         </w:tc>
       </w:tr>
@@ -154,9 +197,40 @@
               <w:spacing w:before="240" w:beforeAutospacing="0" w:after="0" w:afterAutospacing="0" w:line="276" w:lineRule="auto"/>
               <w:rPr>
                 <w:rFonts w:ascii="Gill Sans MT" w:hAnsi="Gill Sans MT"/>
-                <w:b/>
+                <w:bCs/>
               </w:rPr>
             </w:pPr>
+            <w:r>
+              <w:rPr>
+                <w:rFonts w:ascii="Gill Sans MT" w:hAnsi="Gill Sans MT"/>
+                <w:bCs/>
+              </w:rPr>
+              <w:t>Praveen Kumar Roy</w:t>
+            </w:r>
+            <w:r>
+              <w:rPr>
+                <w:rFonts w:ascii="Gill Sans MT" w:hAnsi="Gill Sans MT"/>
+                <w:bCs/>
+              </w:rPr>
+              <w:t xml:space="preserve"> (Asst. Prof. @APU-Bh)</w:t>
+            </w:r>
+          </w:p>
+          <w:p>
+            <w:pPr>
+              <w:pStyle w:val="NormalWeb"/>
+              <w:spacing w:before="240" w:beforeAutospacing="0" w:after="0" w:afterAutospacing="0" w:line="276" w:lineRule="auto"/>
+              <w:rPr>
+                <w:rFonts w:ascii="Gill Sans MT" w:hAnsi="Gill Sans MT"/>
+                <w:bCs/>
+              </w:rPr>
+            </w:pPr>
+            <w:r>
+              <w:rPr>
+                <w:rFonts w:ascii="Gill Sans MT" w:hAnsi="Gill Sans MT"/>
+                <w:bCs/>
+              </w:rPr>
+              <w:t>Lina (Asst. Prof. @)</w:t>
+            </w:r>
           </w:p>
         </w:tc>
       </w:tr>
@@ -338,9 +412,52 @@
               <w:spacing w:before="240" w:beforeAutospacing="0" w:after="0" w:afterAutospacing="0" w:line="276" w:lineRule="auto"/>
               <w:rPr>
                 <w:rFonts w:ascii="Gill Sans MT" w:hAnsi="Gill Sans MT"/>
-                <w:b/>
+                <w:bCs/>
+                <w:lang w:val="en-IN"/>
               </w:rPr>
             </w:pPr>
+            <w:r>
+              <w:rPr>
+                <w:rFonts w:ascii="Gill Sans MT" w:hAnsi="Gill Sans MT"/>
+                <w:bCs/>
+                <w:lang w:val="en-IN"/>
+              </w:rPr>
+              <w:t>This study investigates the integration of Inquiry</w:t>
+            </w:r>
+            <w:r>
+              <w:rPr>
+                <w:rFonts w:ascii="Gill Sans MT" w:hAnsi="Gill Sans MT"/>
+                <w:bCs/>
+                <w:lang w:val="en-IN"/>
+              </w:rPr>
+              <w:noBreakHyphen/>
+              <w:t>Based Learning (IBL) with the history of mathematics in teaching number theory to first</w:t>
+            </w:r>
+            <w:r>
+              <w:rPr>
+                <w:rFonts w:ascii="Gill Sans MT" w:hAnsi="Gill Sans MT"/>
+                <w:bCs/>
+                <w:lang w:val="en-IN"/>
+              </w:rPr>
+              <w:noBreakHyphen/>
+              <w:t>year undergraduates. Developed through collaboration between India and Israel, the project combines diverse mathematical traditions and pedagogical perspectives. Its goal is to introduce students not only to foundational number theory concepts but also to the broader culture of mathematics</w:t>
+            </w:r>
+            <w:r>
+              <w:rPr>
+                <w:rFonts w:ascii="Gill Sans MT" w:hAnsi="Gill Sans MT"/>
+                <w:bCs/>
+                <w:lang w:val="en-IN"/>
+              </w:rPr>
+              <w:t>-</w:t>
+            </w:r>
+            <w:r>
+              <w:rPr>
+                <w:rFonts w:ascii="Gill Sans MT" w:hAnsi="Gill Sans MT"/>
+                <w:bCs/>
+                <w:lang w:val="en-IN"/>
+              </w:rPr>
+              <w:t>its reasoning styles, historical development, and communal practices of conjecture and proof.</w:t>
+            </w:r>
           </w:p>
           <w:p>
             <w:pPr>
@@ -348,9 +465,55 @@
               <w:spacing w:before="240" w:beforeAutospacing="0" w:after="0" w:afterAutospacing="0" w:line="276" w:lineRule="auto"/>
               <w:rPr>
                 <w:rFonts w:ascii="Gill Sans MT" w:hAnsi="Gill Sans MT"/>
-                <w:b/>
+                <w:bCs/>
+                <w:lang w:val="en-IN"/>
               </w:rPr>
             </w:pPr>
+            <w:r>
+              <w:rPr>
+                <w:rFonts w:ascii="Gill Sans MT" w:hAnsi="Gill Sans MT"/>
+                <w:bCs/>
+                <w:lang w:val="en-IN"/>
+              </w:rPr>
+              <w:t>Historically informed inquiry tasks, such as reconstructing classical proofs and exploring Diophantine problems, position mathematics as an active and evolving discipline. By engaging students in authentic processes of questioning, testing, and discovery, the approach situates learning within a long intellectual continuum.</w:t>
+            </w:r>
+          </w:p>
+          <w:p>
+            <w:pPr>
+              <w:pStyle w:val="NormalWeb"/>
+              <w:spacing w:before="240" w:beforeAutospacing="0" w:after="0" w:afterAutospacing="0" w:line="276" w:lineRule="auto"/>
+              <w:rPr>
+                <w:rFonts w:ascii="Gill Sans MT" w:hAnsi="Gill Sans MT"/>
+                <w:bCs/>
+                <w:lang w:val="en-IN"/>
+              </w:rPr>
+            </w:pPr>
+            <w:r>
+              <w:rPr>
+                <w:rFonts w:ascii="Gill Sans MT" w:hAnsi="Gill Sans MT"/>
+                <w:bCs/>
+                <w:lang w:val="en-IN"/>
+              </w:rPr>
+              <w:t xml:space="preserve">We argue that this combined framework deepens conceptual understanding, strengthens mathematical identity, and enhances appreciation of mathematics as a global human </w:t>
+            </w:r>
+            <w:proofErr w:type="spellStart"/>
+            <w:r>
+              <w:rPr>
+                <w:rFonts w:ascii="Gill Sans MT" w:hAnsi="Gill Sans MT"/>
+                <w:bCs/>
+                <w:lang w:val="en-IN"/>
+              </w:rPr>
+              <w:t>endeavor</w:t>
+            </w:r>
+            <w:proofErr w:type="spellEnd"/>
+            <w:r>
+              <w:rPr>
+                <w:rFonts w:ascii="Gill Sans MT" w:hAnsi="Gill Sans MT"/>
+                <w:bCs/>
+                <w:lang w:val="en-IN"/>
+              </w:rPr>
+              <w:t>, demonstrating its potential to transform early university teaching of number theory.</w:t>
+            </w:r>
           </w:p>
           <w:p>
             <w:pPr>
@@ -396,6 +559,7 @@
               <w:rPr>
                 <w:rFonts w:ascii="Gill Sans MT" w:hAnsi="Gill Sans MT"/>
               </w:rPr>
+              <w:lastRenderedPageBreak/>
               <w:t>Project Duration:</w:t>
             </w:r>
           </w:p>
@@ -411,9 +575,16 @@
               <w:spacing w:before="240" w:beforeAutospacing="0" w:after="0" w:afterAutospacing="0" w:line="276" w:lineRule="auto"/>
               <w:rPr>
                 <w:rFonts w:ascii="Gill Sans MT" w:hAnsi="Gill Sans MT"/>
-                <w:b/>
+                <w:bCs/>
               </w:rPr>
             </w:pPr>
+            <w:r>
+              <w:rPr>
+                <w:rFonts w:ascii="Gill Sans MT" w:hAnsi="Gill Sans MT"/>
+                <w:bCs/>
+              </w:rPr>
+              <w:t>One Semester</w:t>
+            </w:r>
           </w:p>
         </w:tc>
       </w:tr>
@@ -455,9 +626,31 @@
               <w:spacing w:before="240" w:beforeAutospacing="0" w:after="0" w:afterAutospacing="0" w:line="276" w:lineRule="auto"/>
               <w:rPr>
                 <w:rFonts w:ascii="Gill Sans MT" w:hAnsi="Gill Sans MT"/>
-                <w:b/>
+                <w:bCs/>
               </w:rPr>
             </w:pPr>
+            <w:r>
+              <w:rPr>
+                <w:rFonts w:ascii="Gill Sans MT" w:hAnsi="Gill Sans MT"/>
+                <w:bCs/>
+              </w:rPr>
+              <w:t>17</w:t>
+            </w:r>
+            <w:r>
+              <w:rPr>
+                <w:rFonts w:ascii="Gill Sans MT" w:hAnsi="Gill Sans MT"/>
+                <w:bCs/>
+                <w:vertAlign w:val="superscript"/>
+              </w:rPr>
+              <w:t>th</w:t>
+            </w:r>
+            <w:r>
+              <w:rPr>
+                <w:rFonts w:ascii="Gill Sans MT" w:hAnsi="Gill Sans MT"/>
+                <w:bCs/>
+              </w:rPr>
+              <w:t xml:space="preserve"> August 2026</w:t>
+            </w:r>
           </w:p>
         </w:tc>
       </w:tr>
@@ -506,6 +699,12 @@
                 <w:rFonts w:ascii="Gill Sans MT" w:hAnsi="Gill Sans MT"/>
               </w:rPr>
             </w:pPr>
+            <w:r>
+              <w:rPr>
+                <w:rFonts w:ascii="Gill Sans MT" w:hAnsi="Gill Sans MT"/>
+              </w:rPr>
+              <w:t>Nil</w:t>
+            </w:r>
           </w:p>
         </w:tc>
       </w:tr>
@@ -554,6 +753,12 @@
                 <w:rFonts w:ascii="Gill Sans MT" w:hAnsi="Gill Sans MT"/>
               </w:rPr>
             </w:pPr>
+            <w:r>
+              <w:rPr>
+                <w:rFonts w:ascii="Gill Sans MT" w:hAnsi="Gill Sans MT"/>
+              </w:rPr>
+              <w:t>None</w:t>
+            </w:r>
           </w:p>
         </w:tc>
       </w:tr>
@@ -1009,6 +1214,7 @@
         <w:rPr>
           <w:rFonts w:ascii="Gill Sans MT" w:eastAsia="Palatino Linotype" w:hAnsi="Gill Sans MT" w:cs="Palatino Linotype"/>
         </w:rPr>
+        <w:lastRenderedPageBreak/>
         <w:t xml:space="preserve">This should cover a </w:t>
       </w:r>
       <w:r>
@@ -1463,7 +1669,6 @@
                 <w:rFonts w:ascii="Gill Sans MT" w:eastAsia="Palatino Linotype" w:hAnsi="Gill Sans MT" w:cs="Palatino Linotype"/>
                 <w:b/>
               </w:rPr>
-              <w:lastRenderedPageBreak/>
               <w:t>Targeted time</w:t>
             </w:r>
           </w:p>
@@ -1909,6 +2114,7 @@
           <w:rFonts w:ascii="Gill Sans MT" w:hAnsi="Gill Sans MT"/>
           <w:b/>
         </w:rPr>
+        <w:lastRenderedPageBreak/>
         <w:t>1.6 Budget:</w:t>
       </w:r>
     </w:p>
@@ -2497,7 +2703,7 @@
 </file>
 
 <file path=word/endnotes.xml><?xml version="1.0" encoding="utf-8"?>
-<w:endnotes xmlns:wpc="http://schemas.microsoft.com/office/word/2010/wordprocessingCanvas" xmlns:cx="http://schemas.microsoft.com/office/drawing/2014/chartex" xmlns:cx1="http://schemas.microsoft.com/office/drawing/2015/9/8/chartex" xmlns:cx2="http://schemas.microsoft.com/office/drawing/2015/10/21/chartex" xmlns:cx3="http://schemas.microsoft.com/office/drawing/2016/5/9/chartex" xmlns:cx4="http://schemas.microsoft.com/office/drawing/2016/5/10/chartex" xmlns:cx5="http://schemas.microsoft.com/office/drawing/2016/5/11/chartex" xmlns:cx6="http://schemas.microsoft.com/office/drawing/2016/5/12/chartex" xmlns:cx7="http://schemas.microsoft.com/office/drawing/2016/5/13/chartex" xmlns:cx8="http://schemas.microsoft.com/office/drawing/2016/5/14/chartex" xmlns:mc="http://schemas.openxmlformats.org/markup-compatibility/2006" xmlns:aink="http://schemas.microsoft.com/office/drawing/2016/ink" xmlns:am3d="http://schemas.microsoft.com/office/drawing/2017/model3d" xmlns:o="urn:schemas-microsoft-com:office:office" xmlns:r="http://schemas.openxmlformats.org/officeDocument/2006/relationships" xmlns:m="http://schemas.openxmlformats.org/officeDocument/2006/math" xmlns:v="urn:schemas-microsoft-com:vml" xmlns:wp14="http://schemas.microsoft.com/office/word/2010/wordprocessingDrawing" xmlns:wp="http://schemas.openxmlformats.org/drawingml/2006/wordprocessingDrawing" xmlns:w10="urn:schemas-microsoft-com:office:word" xmlns:w="http://schemas.openxmlformats.org/wordprocessingml/2006/main" xmlns:w14="http://schemas.microsoft.com/office/word/2010/wordml" xmlns:w15="http://schemas.microsoft.com/office/word/2012/wordml" xmlns:w16cex="http://schemas.microsoft.com/office/word/2018/wordml/cex" xmlns:w16cid="http://schemas.microsoft.com/office/word/2016/wordml/cid" xmlns:w16="http://schemas.microsoft.com/office/word/2018/wordml" xmlns:w16se="http://schemas.microsoft.com/office/word/2015/wordml/symex" xmlns:wpg="http://schemas.microsoft.com/office/word/2010/wordprocessingGroup" xmlns:wpi="http://schemas.microsoft.com/office/word/2010/wordprocessingInk" xmlns:wne="http://schemas.microsoft.com/office/word/2006/wordml" xmlns:wps="http://schemas.microsoft.com/office/word/2010/wordprocessingShape" mc:Ignorable="w14 w15 w16se w16cid w16 w16cex wp14">
+<w:endnotes xmlns:wpc="http://schemas.microsoft.com/office/word/2010/wordprocessingCanvas" xmlns:cx="http://schemas.microsoft.com/office/drawing/2014/chartex" xmlns:cx1="http://schemas.microsoft.com/office/drawing/2015/9/8/chartex" xmlns:cx2="http://schemas.microsoft.com/office/drawing/2015/10/21/chartex" xmlns:cx3="http://schemas.microsoft.com/office/drawing/2016/5/9/chartex" xmlns:cx4="http://schemas.microsoft.com/office/drawing/2016/5/10/chartex" xmlns:cx5="http://schemas.microsoft.com/office/drawing/2016/5/11/chartex" xmlns:cx6="http://schemas.microsoft.com/office/drawing/2016/5/12/chartex" xmlns:cx7="http://schemas.microsoft.com/office/drawing/2016/5/13/chartex" xmlns:cx8="http://schemas.microsoft.com/office/drawing/2016/5/14/chartex" xmlns:mc="http://schemas.openxmlformats.org/markup-compatibility/2006" xmlns:aink="http://schemas.microsoft.com/office/drawing/2016/ink" xmlns:am3d="http://schemas.microsoft.com/office/drawing/2017/model3d" xmlns:o="urn:schemas-microsoft-com:office:office" xmlns:oel="http://schemas.microsoft.com/office/2019/extlst" xmlns:r="http://schemas.openxmlformats.org/officeDocument/2006/relationships" xmlns:m="http://schemas.openxmlformats.org/officeDocument/2006/math" xmlns:v="urn:schemas-microsoft-com:vml" xmlns:wp14="http://schemas.microsoft.com/office/word/2010/wordprocessingDrawing" xmlns:wp="http://schemas.openxmlformats.org/drawingml/2006/wordprocessingDrawing" xmlns:w10="urn:schemas-microsoft-com:office:word" xmlns:w="http://schemas.openxmlformats.org/wordprocessingml/2006/main" xmlns:w14="http://schemas.microsoft.com/office/word/2010/wordml" xmlns:w15="http://schemas.microsoft.com/office/word/2012/wordml" xmlns:w16cex="http://schemas.microsoft.com/office/word/2018/wordml/cex" xmlns:w16cid="http://schemas.microsoft.com/office/word/2016/wordml/cid" xmlns:w16="http://schemas.microsoft.com/office/word/2018/wordml" xmlns:w16sdtdh="http://schemas.microsoft.com/office/word/2020/wordml/sdtdatahash" xmlns:w16se="http://schemas.microsoft.com/office/word/2015/wordml/symex" xmlns:wpg="http://schemas.microsoft.com/office/word/2010/wordprocessingGroup" xmlns:wpi="http://schemas.microsoft.com/office/word/2010/wordprocessingInk" xmlns:wne="http://schemas.microsoft.com/office/word/2006/wordml" xmlns:wps="http://schemas.microsoft.com/office/word/2010/wordprocessingShape" mc:Ignorable="w14 w15 w16se w16cid w16 w16cex w16sdtdh wp14">
   <w:endnote w:type="separator" w:id="-1">
     <w:p>
       <w:r>
@@ -2519,7 +2725,7 @@
 </file>
 
 <file path=word/footer1.xml><?xml version="1.0" encoding="utf-8"?>
-<w:ftr xmlns:wpc="http://schemas.microsoft.com/office/word/2010/wordprocessingCanvas" xmlns:cx="http://schemas.microsoft.com/office/drawing/2014/chartex" xmlns:cx1="http://schemas.microsoft.com/office/drawing/2015/9/8/chartex" xmlns:cx2="http://schemas.microsoft.com/office/drawing/2015/10/21/chartex" xmlns:cx3="http://schemas.microsoft.com/office/drawing/2016/5/9/chartex" xmlns:cx4="http://schemas.microsoft.com/office/drawing/2016/5/10/chartex" xmlns:cx5="http://schemas.microsoft.com/office/drawing/2016/5/11/chartex" xmlns:cx6="http://schemas.microsoft.com/office/drawing/2016/5/12/chartex" xmlns:cx7="http://schemas.microsoft.com/office/drawing/2016/5/13/chartex" xmlns:cx8="http://schemas.microsoft.com/office/drawing/2016/5/14/chartex" xmlns:mc="http://schemas.openxmlformats.org/markup-compatibility/2006" xmlns:aink="http://schemas.microsoft.com/office/drawing/2016/ink" xmlns:am3d="http://schemas.microsoft.com/office/drawing/2017/model3d" xmlns:o="urn:schemas-microsoft-com:office:office" xmlns:r="http://schemas.openxmlformats.org/officeDocument/2006/relationships" xmlns:m="http://schemas.openxmlformats.org/officeDocument/2006/math" xmlns:v="urn:schemas-microsoft-com:vml" xmlns:wp14="http://schemas.microsoft.com/office/word/2010/wordprocessingDrawing" xmlns:wp="http://schemas.openxmlformats.org/drawingml/2006/wordprocessingDrawing" xmlns:w10="urn:schemas-microsoft-com:office:word" xmlns:w="http://schemas.openxmlformats.org/wordprocessingml/2006/main" xmlns:w14="http://schemas.microsoft.com/office/word/2010/wordml" xmlns:w15="http://schemas.microsoft.com/office/word/2012/wordml" xmlns:w16cex="http://schemas.microsoft.com/office/word/2018/wordml/cex" xmlns:w16cid="http://schemas.microsoft.com/office/word/2016/wordml/cid" xmlns:w16="http://schemas.microsoft.com/office/word/2018/wordml" xmlns:w16se="http://schemas.microsoft.com/office/word/2015/wordml/symex" xmlns:wpg="http://schemas.microsoft.com/office/word/2010/wordprocessingGroup" xmlns:wpi="http://schemas.microsoft.com/office/word/2010/wordprocessingInk" xmlns:wne="http://schemas.microsoft.com/office/word/2006/wordml" xmlns:wps="http://schemas.microsoft.com/office/word/2010/wordprocessingShape" mc:Ignorable="w14 w15 w16se w16cid w16 w16cex wp14">
+<w:ftr xmlns:wpc="http://schemas.microsoft.com/office/word/2010/wordprocessingCanvas" xmlns:cx="http://schemas.microsoft.com/office/drawing/2014/chartex" xmlns:cx1="http://schemas.microsoft.com/office/drawing/2015/9/8/chartex" xmlns:cx2="http://schemas.microsoft.com/office/drawing/2015/10/21/chartex" xmlns:cx3="http://schemas.microsoft.com/office/drawing/2016/5/9/chartex" xmlns:cx4="http://schemas.microsoft.com/office/drawing/2016/5/10/chartex" xmlns:cx5="http://schemas.microsoft.com/office/drawing/2016/5/11/chartex" xmlns:cx6="http://schemas.microsoft.com/office/drawing/2016/5/12/chartex" xmlns:cx7="http://schemas.microsoft.com/office/drawing/2016/5/13/chartex" xmlns:cx8="http://schemas.microsoft.com/office/drawing/2016/5/14/chartex" xmlns:mc="http://schemas.openxmlformats.org/markup-compatibility/2006" xmlns:aink="http://schemas.microsoft.com/office/drawing/2016/ink" xmlns:am3d="http://schemas.microsoft.com/office/drawing/2017/model3d" xmlns:o="urn:schemas-microsoft-com:office:office" xmlns:oel="http://schemas.microsoft.com/office/2019/extlst" xmlns:r="http://schemas.openxmlformats.org/officeDocument/2006/relationships" xmlns:m="http://schemas.openxmlformats.org/officeDocument/2006/math" xmlns:v="urn:schemas-microsoft-com:vml" xmlns:wp14="http://schemas.microsoft.com/office/word/2010/wordprocessingDrawing" xmlns:wp="http://schemas.openxmlformats.org/drawingml/2006/wordprocessingDrawing" xmlns:w10="urn:schemas-microsoft-com:office:word" xmlns:w="http://schemas.openxmlformats.org/wordprocessingml/2006/main" xmlns:w14="http://schemas.microsoft.com/office/word/2010/wordml" xmlns:w15="http://schemas.microsoft.com/office/word/2012/wordml" xmlns:w16cex="http://schemas.microsoft.com/office/word/2018/wordml/cex" xmlns:w16cid="http://schemas.microsoft.com/office/word/2016/wordml/cid" xmlns:w16="http://schemas.microsoft.com/office/word/2018/wordml" xmlns:w16sdtdh="http://schemas.microsoft.com/office/word/2020/wordml/sdtdatahash" xmlns:w16se="http://schemas.microsoft.com/office/word/2015/wordml/symex" xmlns:wpg="http://schemas.microsoft.com/office/word/2010/wordprocessingGroup" xmlns:wpi="http://schemas.microsoft.com/office/word/2010/wordprocessingInk" xmlns:wne="http://schemas.microsoft.com/office/word/2006/wordml" xmlns:wps="http://schemas.microsoft.com/office/word/2010/wordprocessingShape" mc:Ignorable="w14 w15 w16se w16cid w16 w16cex w16sdtdh wp14">
   <w:p>
     <w:pPr>
       <w:pBdr>
@@ -2579,7 +2785,7 @@
 </file>
 
 <file path=word/footer2.xml><?xml version="1.0" encoding="utf-8"?>
-<w:ftr xmlns:wpc="http://schemas.microsoft.com/office/word/2010/wordprocessingCanvas" xmlns:cx="http://schemas.microsoft.com/office/drawing/2014/chartex" xmlns:cx1="http://schemas.microsoft.com/office/drawing/2015/9/8/chartex" xmlns:cx2="http://schemas.microsoft.com/office/drawing/2015/10/21/chartex" xmlns:cx3="http://schemas.microsoft.com/office/drawing/2016/5/9/chartex" xmlns:cx4="http://schemas.microsoft.com/office/drawing/2016/5/10/chartex" xmlns:cx5="http://schemas.microsoft.com/office/drawing/2016/5/11/chartex" xmlns:cx6="http://schemas.microsoft.com/office/drawing/2016/5/12/chartex" xmlns:cx7="http://schemas.microsoft.com/office/drawing/2016/5/13/chartex" xmlns:cx8="http://schemas.microsoft.com/office/drawing/2016/5/14/chartex" xmlns:mc="http://schemas.openxmlformats.org/markup-compatibility/2006" xmlns:aink="http://schemas.microsoft.com/office/drawing/2016/ink" xmlns:am3d="http://schemas.microsoft.com/office/drawing/2017/model3d" xmlns:o="urn:schemas-microsoft-com:office:office" xmlns:r="http://schemas.openxmlformats.org/officeDocument/2006/relationships" xmlns:m="http://schemas.openxmlformats.org/officeDocument/2006/math" xmlns:v="urn:schemas-microsoft-com:vml" xmlns:wp14="http://schemas.microsoft.com/office/word/2010/wordprocessingDrawing" xmlns:wp="http://schemas.openxmlformats.org/drawingml/2006/wordprocessingDrawing" xmlns:w10="urn:schemas-microsoft-com:office:word" xmlns:w="http://schemas.openxmlformats.org/wordprocessingml/2006/main" xmlns:w14="http://schemas.microsoft.com/office/word/2010/wordml" xmlns:w15="http://schemas.microsoft.com/office/word/2012/wordml" xmlns:w16cex="http://schemas.microsoft.com/office/word/2018/wordml/cex" xmlns:w16cid="http://schemas.microsoft.com/office/word/2016/wordml/cid" xmlns:w16="http://schemas.microsoft.com/office/word/2018/wordml" xmlns:w16se="http://schemas.microsoft.com/office/word/2015/wordml/symex" xmlns:wpg="http://schemas.microsoft.com/office/word/2010/wordprocessingGroup" xmlns:wpi="http://schemas.microsoft.com/office/word/2010/wordprocessingInk" xmlns:wne="http://schemas.microsoft.com/office/word/2006/wordml" xmlns:wps="http://schemas.microsoft.com/office/word/2010/wordprocessingShape" mc:Ignorable="w14 w15 w16se w16cid w16 w16cex wp14">
+<w:ftr xmlns:wpc="http://schemas.microsoft.com/office/word/2010/wordprocessingCanvas" xmlns:cx="http://schemas.microsoft.com/office/drawing/2014/chartex" xmlns:cx1="http://schemas.microsoft.com/office/drawing/2015/9/8/chartex" xmlns:cx2="http://schemas.microsoft.com/office/drawing/2015/10/21/chartex" xmlns:cx3="http://schemas.microsoft.com/office/drawing/2016/5/9/chartex" xmlns:cx4="http://schemas.microsoft.com/office/drawing/2016/5/10/chartex" xmlns:cx5="http://schemas.microsoft.com/office/drawing/2016/5/11/chartex" xmlns:cx6="http://schemas.microsoft.com/office/drawing/2016/5/12/chartex" xmlns:cx7="http://schemas.microsoft.com/office/drawing/2016/5/13/chartex" xmlns:cx8="http://schemas.microsoft.com/office/drawing/2016/5/14/chartex" xmlns:mc="http://schemas.openxmlformats.org/markup-compatibility/2006" xmlns:aink="http://schemas.microsoft.com/office/drawing/2016/ink" xmlns:am3d="http://schemas.microsoft.com/office/drawing/2017/model3d" xmlns:o="urn:schemas-microsoft-com:office:office" xmlns:oel="http://schemas.microsoft.com/office/2019/extlst" xmlns:r="http://schemas.openxmlformats.org/officeDocument/2006/relationships" xmlns:m="http://schemas.openxmlformats.org/officeDocument/2006/math" xmlns:v="urn:schemas-microsoft-com:vml" xmlns:wp14="http://schemas.microsoft.com/office/word/2010/wordprocessingDrawing" xmlns:wp="http://schemas.openxmlformats.org/drawingml/2006/wordprocessingDrawing" xmlns:w10="urn:schemas-microsoft-com:office:word" xmlns:w="http://schemas.openxmlformats.org/wordprocessingml/2006/main" xmlns:w14="http://schemas.microsoft.com/office/word/2010/wordml" xmlns:w15="http://schemas.microsoft.com/office/word/2012/wordml" xmlns:w16cex="http://schemas.microsoft.com/office/word/2018/wordml/cex" xmlns:w16cid="http://schemas.microsoft.com/office/word/2016/wordml/cid" xmlns:w16="http://schemas.microsoft.com/office/word/2018/wordml" xmlns:w16sdtdh="http://schemas.microsoft.com/office/word/2020/wordml/sdtdatahash" xmlns:w16se="http://schemas.microsoft.com/office/word/2015/wordml/symex" xmlns:wpg="http://schemas.microsoft.com/office/word/2010/wordprocessingGroup" xmlns:wpi="http://schemas.microsoft.com/office/word/2010/wordprocessingInk" xmlns:wne="http://schemas.microsoft.com/office/word/2006/wordml" xmlns:wps="http://schemas.microsoft.com/office/word/2010/wordprocessingShape" mc:Ignorable="w14 w15 w16se w16cid w16 w16cex w16sdtdh wp14">
   <w:p>
     <w:pPr>
       <w:pBdr>
@@ -2652,7 +2858,7 @@
 </file>
 
 <file path=word/footer3.xml><?xml version="1.0" encoding="utf-8"?>
-<w:ftr xmlns:wpc="http://schemas.microsoft.com/office/word/2010/wordprocessingCanvas" xmlns:cx="http://schemas.microsoft.com/office/drawing/2014/chartex" xmlns:cx1="http://schemas.microsoft.com/office/drawing/2015/9/8/chartex" xmlns:cx2="http://schemas.microsoft.com/office/drawing/2015/10/21/chartex" xmlns:cx3="http://schemas.microsoft.com/office/drawing/2016/5/9/chartex" xmlns:cx4="http://schemas.microsoft.com/office/drawing/2016/5/10/chartex" xmlns:cx5="http://schemas.microsoft.com/office/drawing/2016/5/11/chartex" xmlns:cx6="http://schemas.microsoft.com/office/drawing/2016/5/12/chartex" xmlns:cx7="http://schemas.microsoft.com/office/drawing/2016/5/13/chartex" xmlns:cx8="http://schemas.microsoft.com/office/drawing/2016/5/14/chartex" xmlns:mc="http://schemas.openxmlformats.org/markup-compatibility/2006" xmlns:aink="http://schemas.microsoft.com/office/drawing/2016/ink" xmlns:am3d="http://schemas.microsoft.com/office/drawing/2017/model3d" xmlns:o="urn:schemas-microsoft-com:office:office" xmlns:r="http://schemas.openxmlformats.org/officeDocument/2006/relationships" xmlns:m="http://schemas.openxmlformats.org/officeDocument/2006/math" xmlns:v="urn:schemas-microsoft-com:vml" xmlns:wp14="http://schemas.microsoft.com/office/word/2010/wordprocessingDrawing" xmlns:wp="http://schemas.openxmlformats.org/drawingml/2006/wordprocessingDrawing" xmlns:w10="urn:schemas-microsoft-com:office:word" xmlns:w="http://schemas.openxmlformats.org/wordprocessingml/2006/main" xmlns:w14="http://schemas.microsoft.com/office/word/2010/wordml" xmlns:w15="http://schemas.microsoft.com/office/word/2012/wordml" xmlns:w16cex="http://schemas.microsoft.com/office/word/2018/wordml/cex" xmlns:w16cid="http://schemas.microsoft.com/office/word/2016/wordml/cid" xmlns:w16="http://schemas.microsoft.com/office/word/2018/wordml" xmlns:w16se="http://schemas.microsoft.com/office/word/2015/wordml/symex" xmlns:wpg="http://schemas.microsoft.com/office/word/2010/wordprocessingGroup" xmlns:wpi="http://schemas.microsoft.com/office/word/2010/wordprocessingInk" xmlns:wne="http://schemas.microsoft.com/office/word/2006/wordml" xmlns:wps="http://schemas.microsoft.com/office/word/2010/wordprocessingShape" mc:Ignorable="w14 w15 w16se w16cid w16 w16cex wp14">
+<w:ftr xmlns:wpc="http://schemas.microsoft.com/office/word/2010/wordprocessingCanvas" xmlns:cx="http://schemas.microsoft.com/office/drawing/2014/chartex" xmlns:cx1="http://schemas.microsoft.com/office/drawing/2015/9/8/chartex" xmlns:cx2="http://schemas.microsoft.com/office/drawing/2015/10/21/chartex" xmlns:cx3="http://schemas.microsoft.com/office/drawing/2016/5/9/chartex" xmlns:cx4="http://schemas.microsoft.com/office/drawing/2016/5/10/chartex" xmlns:cx5="http://schemas.microsoft.com/office/drawing/2016/5/11/chartex" xmlns:cx6="http://schemas.microsoft.com/office/drawing/2016/5/12/chartex" xmlns:cx7="http://schemas.microsoft.com/office/drawing/2016/5/13/chartex" xmlns:cx8="http://schemas.microsoft.com/office/drawing/2016/5/14/chartex" xmlns:mc="http://schemas.openxmlformats.org/markup-compatibility/2006" xmlns:aink="http://schemas.microsoft.com/office/drawing/2016/ink" xmlns:am3d="http://schemas.microsoft.com/office/drawing/2017/model3d" xmlns:o="urn:schemas-microsoft-com:office:office" xmlns:oel="http://schemas.microsoft.com/office/2019/extlst" xmlns:r="http://schemas.openxmlformats.org/officeDocument/2006/relationships" xmlns:m="http://schemas.openxmlformats.org/officeDocument/2006/math" xmlns:v="urn:schemas-microsoft-com:vml" xmlns:wp14="http://schemas.microsoft.com/office/word/2010/wordprocessingDrawing" xmlns:wp="http://schemas.openxmlformats.org/drawingml/2006/wordprocessingDrawing" xmlns:w10="urn:schemas-microsoft-com:office:word" xmlns:w="http://schemas.openxmlformats.org/wordprocessingml/2006/main" xmlns:w14="http://schemas.microsoft.com/office/word/2010/wordml" xmlns:w15="http://schemas.microsoft.com/office/word/2012/wordml" xmlns:w16cex="http://schemas.microsoft.com/office/word/2018/wordml/cex" xmlns:w16cid="http://schemas.microsoft.com/office/word/2016/wordml/cid" xmlns:w16="http://schemas.microsoft.com/office/word/2018/wordml" xmlns:w16sdtdh="http://schemas.microsoft.com/office/word/2020/wordml/sdtdatahash" xmlns:w16se="http://schemas.microsoft.com/office/word/2015/wordml/symex" xmlns:wpg="http://schemas.microsoft.com/office/word/2010/wordprocessingGroup" xmlns:wpi="http://schemas.microsoft.com/office/word/2010/wordprocessingInk" xmlns:wne="http://schemas.microsoft.com/office/word/2006/wordml" xmlns:wps="http://schemas.microsoft.com/office/word/2010/wordprocessingShape" mc:Ignorable="w14 w15 w16se w16cid w16 w16cex w16sdtdh wp14">
   <w:p>
     <w:pPr>
       <w:pStyle w:val="Footer"/>
@@ -2802,7 +3008,7 @@
 </file>
 
 <file path=word/footnotes.xml><?xml version="1.0" encoding="utf-8"?>
-<w:footnotes xmlns:wpc="http://schemas.microsoft.com/office/word/2010/wordprocessingCanvas" xmlns:cx="http://schemas.microsoft.com/office/drawing/2014/chartex" xmlns:cx1="http://schemas.microsoft.com/office/drawing/2015/9/8/chartex" xmlns:cx2="http://schemas.microsoft.com/office/drawing/2015/10/21/chartex" xmlns:cx3="http://schemas.microsoft.com/office/drawing/2016/5/9/chartex" xmlns:cx4="http://schemas.microsoft.com/office/drawing/2016/5/10/chartex" xmlns:cx5="http://schemas.microsoft.com/office/drawing/2016/5/11/chartex" xmlns:cx6="http://schemas.microsoft.com/office/drawing/2016/5/12/chartex" xmlns:cx7="http://schemas.microsoft.com/office/drawing/2016/5/13/chartex" xmlns:cx8="http://schemas.microsoft.com/office/drawing/2016/5/14/chartex" xmlns:mc="http://schemas.openxmlformats.org/markup-compatibility/2006" xmlns:aink="http://schemas.microsoft.com/office/drawing/2016/ink" xmlns:am3d="http://schemas.microsoft.com/office/drawing/2017/model3d" xmlns:o="urn:schemas-microsoft-com:office:office" xmlns:r="http://schemas.openxmlformats.org/officeDocument/2006/relationships" xmlns:m="http://schemas.openxmlformats.org/officeDocument/2006/math" xmlns:v="urn:schemas-microsoft-com:vml" xmlns:wp14="http://schemas.microsoft.com/office/word/2010/wordprocessingDrawing" xmlns:wp="http://schemas.openxmlformats.org/drawingml/2006/wordprocessingDrawing" xmlns:w10="urn:schemas-microsoft-com:office:word" xmlns:w="http://schemas.openxmlformats.org/wordprocessingml/2006/main" xmlns:w14="http://schemas.microsoft.com/office/word/2010/wordml" xmlns:w15="http://schemas.microsoft.com/office/word/2012/wordml" xmlns:w16cex="http://schemas.microsoft.com/office/word/2018/wordml/cex" xmlns:w16cid="http://schemas.microsoft.com/office/word/2016/wordml/cid" xmlns:w16="http://schemas.microsoft.com/office/word/2018/wordml" xmlns:w16se="http://schemas.microsoft.com/office/word/2015/wordml/symex" xmlns:wpg="http://schemas.microsoft.com/office/word/2010/wordprocessingGroup" xmlns:wpi="http://schemas.microsoft.com/office/word/2010/wordprocessingInk" xmlns:wne="http://schemas.microsoft.com/office/word/2006/wordml" xmlns:wps="http://schemas.microsoft.com/office/word/2010/wordprocessingShape" mc:Ignorable="w14 w15 w16se w16cid w16 w16cex wp14">
+<w:footnotes xmlns:wpc="http://schemas.microsoft.com/office/word/2010/wordprocessingCanvas" xmlns:cx="http://schemas.microsoft.com/office/drawing/2014/chartex" xmlns:cx1="http://schemas.microsoft.com/office/drawing/2015/9/8/chartex" xmlns:cx2="http://schemas.microsoft.com/office/drawing/2015/10/21/chartex" xmlns:cx3="http://schemas.microsoft.com/office/drawing/2016/5/9/chartex" xmlns:cx4="http://schemas.microsoft.com/office/drawing/2016/5/10/chartex" xmlns:cx5="http://schemas.microsoft.com/office/drawing/2016/5/11/chartex" xmlns:cx6="http://schemas.microsoft.com/office/drawing/2016/5/12/chartex" xmlns:cx7="http://schemas.microsoft.com/office/drawing/2016/5/13/chartex" xmlns:cx8="http://schemas.microsoft.com/office/drawing/2016/5/14/chartex" xmlns:mc="http://schemas.openxmlformats.org/markup-compatibility/2006" xmlns:aink="http://schemas.microsoft.com/office/drawing/2016/ink" xmlns:am3d="http://schemas.microsoft.com/office/drawing/2017/model3d" xmlns:o="urn:schemas-microsoft-com:office:office" xmlns:oel="http://schemas.microsoft.com/office/2019/extlst" xmlns:r="http://schemas.openxmlformats.org/officeDocument/2006/relationships" xmlns:m="http://schemas.openxmlformats.org/officeDocument/2006/math" xmlns:v="urn:schemas-microsoft-com:vml" xmlns:wp14="http://schemas.microsoft.com/office/word/2010/wordprocessingDrawing" xmlns:wp="http://schemas.openxmlformats.org/drawingml/2006/wordprocessingDrawing" xmlns:w10="urn:schemas-microsoft-com:office:word" xmlns:w="http://schemas.openxmlformats.org/wordprocessingml/2006/main" xmlns:w14="http://schemas.microsoft.com/office/word/2010/wordml" xmlns:w15="http://schemas.microsoft.com/office/word/2012/wordml" xmlns:w16cex="http://schemas.microsoft.com/office/word/2018/wordml/cex" xmlns:w16cid="http://schemas.microsoft.com/office/word/2016/wordml/cid" xmlns:w16="http://schemas.microsoft.com/office/word/2018/wordml" xmlns:w16sdtdh="http://schemas.microsoft.com/office/word/2020/wordml/sdtdatahash" xmlns:w16se="http://schemas.microsoft.com/office/word/2015/wordml/symex" xmlns:wpg="http://schemas.microsoft.com/office/word/2010/wordprocessingGroup" xmlns:wpi="http://schemas.microsoft.com/office/word/2010/wordprocessingInk" xmlns:wne="http://schemas.microsoft.com/office/word/2006/wordml" xmlns:wps="http://schemas.microsoft.com/office/word/2010/wordprocessingShape" mc:Ignorable="w14 w15 w16se w16cid w16 w16cex w16sdtdh wp14">
   <w:footnote w:type="separator" w:id="-1">
     <w:p>
       <w:r>
@@ -2824,7 +3030,7 @@
 </file>
 
 <file path=word/header1.xml><?xml version="1.0" encoding="utf-8"?>
-<w:hdr xmlns:wpc="http://schemas.microsoft.com/office/word/2010/wordprocessingCanvas" xmlns:cx="http://schemas.microsoft.com/office/drawing/2014/chartex" xmlns:cx1="http://schemas.microsoft.com/office/drawing/2015/9/8/chartex" xmlns:cx2="http://schemas.microsoft.com/office/drawing/2015/10/21/chartex" xmlns:cx3="http://schemas.microsoft.com/office/drawing/2016/5/9/chartex" xmlns:cx4="http://schemas.microsoft.com/office/drawing/2016/5/10/chartex" xmlns:cx5="http://schemas.microsoft.com/office/drawing/2016/5/11/chartex" xmlns:cx6="http://schemas.microsoft.com/office/drawing/2016/5/12/chartex" xmlns:cx7="http://schemas.microsoft.com/office/drawing/2016/5/13/chartex" xmlns:cx8="http://schemas.microsoft.com/office/drawing/2016/5/14/chartex" xmlns:mc="http://schemas.openxmlformats.org/markup-compatibility/2006" xmlns:aink="http://schemas.microsoft.com/office/drawing/2016/ink" xmlns:am3d="http://schemas.microsoft.com/office/drawing/2017/model3d" xmlns:o="urn:schemas-microsoft-com:office:office" xmlns:r="http://schemas.openxmlformats.org/officeDocument/2006/relationships" xmlns:m="http://schemas.openxmlformats.org/officeDocument/2006/math" xmlns:v="urn:schemas-microsoft-com:vml" xmlns:wp14="http://schemas.microsoft.com/office/word/2010/wordprocessingDrawing" xmlns:wp="http://schemas.openxmlformats.org/drawingml/2006/wordprocessingDrawing" xmlns:w10="urn:schemas-microsoft-com:office:word" xmlns:w="http://schemas.openxmlformats.org/wordprocessingml/2006/main" xmlns:w14="http://schemas.microsoft.com/office/word/2010/wordml" xmlns:w15="http://schemas.microsoft.com/office/word/2012/wordml" xmlns:w16cex="http://schemas.microsoft.com/office/word/2018/wordml/cex" xmlns:w16cid="http://schemas.microsoft.com/office/word/2016/wordml/cid" xmlns:w16="http://schemas.microsoft.com/office/word/2018/wordml" xmlns:w16se="http://schemas.microsoft.com/office/word/2015/wordml/symex" xmlns:wpg="http://schemas.microsoft.com/office/word/2010/wordprocessingGroup" xmlns:wpi="http://schemas.microsoft.com/office/word/2010/wordprocessingInk" xmlns:wne="http://schemas.microsoft.com/office/word/2006/wordml" xmlns:wps="http://schemas.microsoft.com/office/word/2010/wordprocessingShape" mc:Ignorable="w14 w15 w16se w16cid w16 w16cex wp14">
+<w:hdr xmlns:wpc="http://schemas.microsoft.com/office/word/2010/wordprocessingCanvas" xmlns:cx="http://schemas.microsoft.com/office/drawing/2014/chartex" xmlns:cx1="http://schemas.microsoft.com/office/drawing/2015/9/8/chartex" xmlns:cx2="http://schemas.microsoft.com/office/drawing/2015/10/21/chartex" xmlns:cx3="http://schemas.microsoft.com/office/drawing/2016/5/9/chartex" xmlns:cx4="http://schemas.microsoft.com/office/drawing/2016/5/10/chartex" xmlns:cx5="http://schemas.microsoft.com/office/drawing/2016/5/11/chartex" xmlns:cx6="http://schemas.microsoft.com/office/drawing/2016/5/12/chartex" xmlns:cx7="http://schemas.microsoft.com/office/drawing/2016/5/13/chartex" xmlns:cx8="http://schemas.microsoft.com/office/drawing/2016/5/14/chartex" xmlns:mc="http://schemas.openxmlformats.org/markup-compatibility/2006" xmlns:aink="http://schemas.microsoft.com/office/drawing/2016/ink" xmlns:am3d="http://schemas.microsoft.com/office/drawing/2017/model3d" xmlns:o="urn:schemas-microsoft-com:office:office" xmlns:oel="http://schemas.microsoft.com/office/2019/extlst" xmlns:r="http://schemas.openxmlformats.org/officeDocument/2006/relationships" xmlns:m="http://schemas.openxmlformats.org/officeDocument/2006/math" xmlns:v="urn:schemas-microsoft-com:vml" xmlns:wp14="http://schemas.microsoft.com/office/word/2010/wordprocessingDrawing" xmlns:wp="http://schemas.openxmlformats.org/drawingml/2006/wordprocessingDrawing" xmlns:w10="urn:schemas-microsoft-com:office:word" xmlns:w="http://schemas.openxmlformats.org/wordprocessingml/2006/main" xmlns:w14="http://schemas.microsoft.com/office/word/2010/wordml" xmlns:w15="http://schemas.microsoft.com/office/word/2012/wordml" xmlns:w16cex="http://schemas.microsoft.com/office/word/2018/wordml/cex" xmlns:w16cid="http://schemas.microsoft.com/office/word/2016/wordml/cid" xmlns:w16="http://schemas.microsoft.com/office/word/2018/wordml" xmlns:w16sdtdh="http://schemas.microsoft.com/office/word/2020/wordml/sdtdatahash" xmlns:w16se="http://schemas.microsoft.com/office/word/2015/wordml/symex" xmlns:wpg="http://schemas.microsoft.com/office/word/2010/wordprocessingGroup" xmlns:wpi="http://schemas.microsoft.com/office/word/2010/wordprocessingInk" xmlns:wne="http://schemas.microsoft.com/office/word/2006/wordml" xmlns:wps="http://schemas.microsoft.com/office/word/2010/wordprocessingShape" mc:Ignorable="w14 w15 w16se w16cid w16 w16cex w16sdtdh wp14">
   <w:p>
     <w:pPr>
       <w:pStyle w:val="Header"/>
@@ -2966,7 +3172,7 @@
 </file>
 
 <file path=word/header2.xml><?xml version="1.0" encoding="utf-8"?>
-<w:hdr xmlns:wpc="http://schemas.microsoft.com/office/word/2010/wordprocessingCanvas" xmlns:cx="http://schemas.microsoft.com/office/drawing/2014/chartex" xmlns:cx1="http://schemas.microsoft.com/office/drawing/2015/9/8/chartex" xmlns:cx2="http://schemas.microsoft.com/office/drawing/2015/10/21/chartex" xmlns:cx3="http://schemas.microsoft.com/office/drawing/2016/5/9/chartex" xmlns:cx4="http://schemas.microsoft.com/office/drawing/2016/5/10/chartex" xmlns:cx5="http://schemas.microsoft.com/office/drawing/2016/5/11/chartex" xmlns:cx6="http://schemas.microsoft.com/office/drawing/2016/5/12/chartex" xmlns:cx7="http://schemas.microsoft.com/office/drawing/2016/5/13/chartex" xmlns:cx8="http://schemas.microsoft.com/office/drawing/2016/5/14/chartex" xmlns:mc="http://schemas.openxmlformats.org/markup-compatibility/2006" xmlns:aink="http://schemas.microsoft.com/office/drawing/2016/ink" xmlns:am3d="http://schemas.microsoft.com/office/drawing/2017/model3d" xmlns:o="urn:schemas-microsoft-com:office:office" xmlns:r="http://schemas.openxmlformats.org/officeDocument/2006/relationships" xmlns:m="http://schemas.openxmlformats.org/officeDocument/2006/math" xmlns:v="urn:schemas-microsoft-com:vml" xmlns:wp14="http://schemas.microsoft.com/office/word/2010/wordprocessingDrawing" xmlns:wp="http://schemas.openxmlformats.org/drawingml/2006/wordprocessingDrawing" xmlns:w10="urn:schemas-microsoft-com:office:word" xmlns:w="http://schemas.openxmlformats.org/wordprocessingml/2006/main" xmlns:w14="http://schemas.microsoft.com/office/word/2010/wordml" xmlns:w15="http://schemas.microsoft.com/office/word/2012/wordml" xmlns:w16cex="http://schemas.microsoft.com/office/word/2018/wordml/cex" xmlns:w16cid="http://schemas.microsoft.com/office/word/2016/wordml/cid" xmlns:w16="http://schemas.microsoft.com/office/word/2018/wordml" xmlns:w16se="http://schemas.microsoft.com/office/word/2015/wordml/symex" xmlns:wpg="http://schemas.microsoft.com/office/word/2010/wordprocessingGroup" xmlns:wpi="http://schemas.microsoft.com/office/word/2010/wordprocessingInk" xmlns:wne="http://schemas.microsoft.com/office/word/2006/wordml" xmlns:wps="http://schemas.microsoft.com/office/word/2010/wordprocessingShape" mc:Ignorable="w14 w15 w16se w16cid w16 w16cex wp14">
+<w:hdr xmlns:wpc="http://schemas.microsoft.com/office/word/2010/wordprocessingCanvas" xmlns:cx="http://schemas.microsoft.com/office/drawing/2014/chartex" xmlns:cx1="http://schemas.microsoft.com/office/drawing/2015/9/8/chartex" xmlns:cx2="http://schemas.microsoft.com/office/drawing/2015/10/21/chartex" xmlns:cx3="http://schemas.microsoft.com/office/drawing/2016/5/9/chartex" xmlns:cx4="http://schemas.microsoft.com/office/drawing/2016/5/10/chartex" xmlns:cx5="http://schemas.microsoft.com/office/drawing/2016/5/11/chartex" xmlns:cx6="http://schemas.microsoft.com/office/drawing/2016/5/12/chartex" xmlns:cx7="http://schemas.microsoft.com/office/drawing/2016/5/13/chartex" xmlns:cx8="http://schemas.microsoft.com/office/drawing/2016/5/14/chartex" xmlns:mc="http://schemas.openxmlformats.org/markup-compatibility/2006" xmlns:aink="http://schemas.microsoft.com/office/drawing/2016/ink" xmlns:am3d="http://schemas.microsoft.com/office/drawing/2017/model3d" xmlns:o="urn:schemas-microsoft-com:office:office" xmlns:oel="http://schemas.microsoft.com/office/2019/extlst" xmlns:r="http://schemas.openxmlformats.org/officeDocument/2006/relationships" xmlns:m="http://schemas.openxmlformats.org/officeDocument/2006/math" xmlns:v="urn:schemas-microsoft-com:vml" xmlns:wp14="http://schemas.microsoft.com/office/word/2010/wordprocessingDrawing" xmlns:wp="http://schemas.openxmlformats.org/drawingml/2006/wordprocessingDrawing" xmlns:w10="urn:schemas-microsoft-com:office:word" xmlns:w="http://schemas.openxmlformats.org/wordprocessingml/2006/main" xmlns:w14="http://schemas.microsoft.com/office/word/2010/wordml" xmlns:w15="http://schemas.microsoft.com/office/word/2012/wordml" xmlns:w16cex="http://schemas.microsoft.com/office/word/2018/wordml/cex" xmlns:w16cid="http://schemas.microsoft.com/office/word/2016/wordml/cid" xmlns:w16="http://schemas.microsoft.com/office/word/2018/wordml" xmlns:w16sdtdh="http://schemas.microsoft.com/office/word/2020/wordml/sdtdatahash" xmlns:w16se="http://schemas.microsoft.com/office/word/2015/wordml/symex" xmlns:wpg="http://schemas.microsoft.com/office/word/2010/wordprocessingGroup" xmlns:wpi="http://schemas.microsoft.com/office/word/2010/wordprocessingInk" xmlns:wne="http://schemas.microsoft.com/office/word/2006/wordml" xmlns:wps="http://schemas.microsoft.com/office/word/2010/wordprocessingShape" mc:Ignorable="w14 w15 w16se w16cid w16 w16cex w16sdtdh wp14">
   <w:p>
     <w:pPr>
       <w:pStyle w:val="Header"/>
@@ -3054,7 +3260,7 @@
 </file>
 
 <file path=word/numbering.xml><?xml version="1.0" encoding="utf-8"?>
-<w:numbering xmlns:wpc="http://schemas.microsoft.com/office/word/2010/wordprocessingCanvas" xmlns:cx="http://schemas.microsoft.com/office/drawing/2014/chartex" xmlns:cx1="http://schemas.microsoft.com/office/drawing/2015/9/8/chartex" xmlns:cx2="http://schemas.microsoft.com/office/drawing/2015/10/21/chartex" xmlns:cx3="http://schemas.microsoft.com/office/drawing/2016/5/9/chartex" xmlns:cx4="http://schemas.microsoft.com/office/drawing/2016/5/10/chartex" xmlns:cx5="http://schemas.microsoft.com/office/drawing/2016/5/11/chartex" xmlns:cx6="http://schemas.microsoft.com/office/drawing/2016/5/12/chartex" xmlns:cx7="http://schemas.microsoft.com/office/drawing/2016/5/13/chartex" xmlns:cx8="http://schemas.microsoft.com/office/drawing/2016/5/14/chartex" xmlns:mc="http://schemas.openxmlformats.org/markup-compatibility/2006" xmlns:aink="http://schemas.microsoft.com/office/drawing/2016/ink" xmlns:am3d="http://schemas.microsoft.com/office/drawing/2017/model3d" xmlns:o="urn:schemas-microsoft-com:office:office" xmlns:r="http://schemas.openxmlformats.org/officeDocument/2006/relationships" xmlns:m="http://schemas.openxmlformats.org/officeDocument/2006/math" xmlns:v="urn:schemas-microsoft-com:vml" xmlns:wp14="http://schemas.microsoft.com/office/word/2010/wordprocessingDrawing" xmlns:wp="http://schemas.openxmlformats.org/drawingml/2006/wordprocessingDrawing" xmlns:w10="urn:schemas-microsoft-com:office:word" xmlns:w="http://schemas.openxmlformats.org/wordprocessingml/2006/main" xmlns:w14="http://schemas.microsoft.com/office/word/2010/wordml" xmlns:w15="http://schemas.microsoft.com/office/word/2012/wordml" xmlns:w16cex="http://schemas.microsoft.com/office/word/2018/wordml/cex" xmlns:w16cid="http://schemas.microsoft.com/office/word/2016/wordml/cid" xmlns:w16="http://schemas.microsoft.com/office/word/2018/wordml" xmlns:w16se="http://schemas.microsoft.com/office/word/2015/wordml/symex" xmlns:wpg="http://schemas.microsoft.com/office/word/2010/wordprocessingGroup" xmlns:wpi="http://schemas.microsoft.com/office/word/2010/wordprocessingInk" xmlns:wne="http://schemas.microsoft.com/office/word/2006/wordml" xmlns:wps="http://schemas.microsoft.com/office/word/2010/wordprocessingShape" mc:Ignorable="w14 w15 w16se w16cid w16 w16cex wp14">
+<w:numbering xmlns:wpc="http://schemas.microsoft.com/office/word/2010/wordprocessingCanvas" xmlns:cx="http://schemas.microsoft.com/office/drawing/2014/chartex" xmlns:cx1="http://schemas.microsoft.com/office/drawing/2015/9/8/chartex" xmlns:cx2="http://schemas.microsoft.com/office/drawing/2015/10/21/chartex" xmlns:cx3="http://schemas.microsoft.com/office/drawing/2016/5/9/chartex" xmlns:cx4="http://schemas.microsoft.com/office/drawing/2016/5/10/chartex" xmlns:cx5="http://schemas.microsoft.com/office/drawing/2016/5/11/chartex" xmlns:cx6="http://schemas.microsoft.com/office/drawing/2016/5/12/chartex" xmlns:cx7="http://schemas.microsoft.com/office/drawing/2016/5/13/chartex" xmlns:cx8="http://schemas.microsoft.com/office/drawing/2016/5/14/chartex" xmlns:mc="http://schemas.openxmlformats.org/markup-compatibility/2006" xmlns:aink="http://schemas.microsoft.com/office/drawing/2016/ink" xmlns:am3d="http://schemas.microsoft.com/office/drawing/2017/model3d" xmlns:o="urn:schemas-microsoft-com:office:office" xmlns:oel="http://schemas.microsoft.com/office/2019/extlst" xmlns:r="http://schemas.openxmlformats.org/officeDocument/2006/relationships" xmlns:m="http://schemas.openxmlformats.org/officeDocument/2006/math" xmlns:v="urn:schemas-microsoft-com:vml" xmlns:wp14="http://schemas.microsoft.com/office/word/2010/wordprocessingDrawing" xmlns:wp="http://schemas.openxmlformats.org/drawingml/2006/wordprocessingDrawing" xmlns:w10="urn:schemas-microsoft-com:office:word" xmlns:w="http://schemas.openxmlformats.org/wordprocessingml/2006/main" xmlns:w14="http://schemas.microsoft.com/office/word/2010/wordml" xmlns:w15="http://schemas.microsoft.com/office/word/2012/wordml" xmlns:w16cex="http://schemas.microsoft.com/office/word/2018/wordml/cex" xmlns:w16cid="http://schemas.microsoft.com/office/word/2016/wordml/cid" xmlns:w16="http://schemas.microsoft.com/office/word/2018/wordml" xmlns:w16sdtdh="http://schemas.microsoft.com/office/word/2020/wordml/sdtdatahash" xmlns:w16se="http://schemas.microsoft.com/office/word/2015/wordml/symex" xmlns:wpg="http://schemas.microsoft.com/office/word/2010/wordprocessingGroup" xmlns:wpi="http://schemas.microsoft.com/office/word/2010/wordprocessingInk" xmlns:wne="http://schemas.microsoft.com/office/word/2006/wordml" xmlns:wps="http://schemas.microsoft.com/office/word/2010/wordprocessingShape" mc:Ignorable="w14 w15 w16se w16cid w16 w16cex w16sdtdh wp14">
   <w:abstractNum w:abstractNumId="0" w15:restartNumberingAfterBreak="0">
     <w:nsid w:val="088C1B38"/>
     <w:multiLevelType w:val="hybridMultilevel"/>
@@ -5589,25 +5795,25 @@
       </w:pPr>
     </w:lvl>
   </w:abstractNum>
-  <w:num w:numId="1">
+  <w:num w:numId="1" w16cid:durableId="467943508">
     <w:abstractNumId w:val="17"/>
   </w:num>
-  <w:num w:numId="2">
+  <w:num w:numId="2" w16cid:durableId="1757751054">
     <w:abstractNumId w:val="9"/>
   </w:num>
-  <w:num w:numId="3">
+  <w:num w:numId="3" w16cid:durableId="1883128735">
     <w:abstractNumId w:val="5"/>
   </w:num>
-  <w:num w:numId="4">
+  <w:num w:numId="4" w16cid:durableId="2075080851">
     <w:abstractNumId w:val="23"/>
   </w:num>
-  <w:num w:numId="5">
+  <w:num w:numId="5" w16cid:durableId="1322658226">
     <w:abstractNumId w:val="15"/>
   </w:num>
-  <w:num w:numId="6">
+  <w:num w:numId="6" w16cid:durableId="490829471">
     <w:abstractNumId w:val="14"/>
   </w:num>
-  <w:num w:numId="7">
+  <w:num w:numId="7" w16cid:durableId="1776244279">
     <w:abstractNumId w:val="13"/>
     <w:lvlOverride w:ilvl="0">
       <w:lvl w:ilvl="0">
@@ -5617,7 +5823,7 @@
       </w:lvl>
     </w:lvlOverride>
   </w:num>
-  <w:num w:numId="8">
+  <w:num w:numId="8" w16cid:durableId="962610273">
     <w:abstractNumId w:val="10"/>
     <w:lvlOverride w:ilvl="0">
       <w:lvl w:ilvl="0">
@@ -5627,7 +5833,7 @@
       </w:lvl>
     </w:lvlOverride>
   </w:num>
-  <w:num w:numId="9">
+  <w:num w:numId="9" w16cid:durableId="429006435">
     <w:abstractNumId w:val="12"/>
     <w:lvlOverride w:ilvl="0">
       <w:lvl w:ilvl="0">
@@ -5637,7 +5843,7 @@
       </w:lvl>
     </w:lvlOverride>
   </w:num>
-  <w:num w:numId="10">
+  <w:num w:numId="10" w16cid:durableId="957565656">
     <w:abstractNumId w:val="19"/>
     <w:lvlOverride w:ilvl="0">
       <w:lvl w:ilvl="0">
@@ -5647,7 +5853,7 @@
       </w:lvl>
     </w:lvlOverride>
   </w:num>
-  <w:num w:numId="11">
+  <w:num w:numId="11" w16cid:durableId="1490292570">
     <w:abstractNumId w:val="18"/>
     <w:lvlOverride w:ilvl="0">
       <w:lvl w:ilvl="0">
@@ -5657,7 +5863,7 @@
       </w:lvl>
     </w:lvlOverride>
   </w:num>
-  <w:num w:numId="12">
+  <w:num w:numId="12" w16cid:durableId="1973172120">
     <w:abstractNumId w:val="8"/>
     <w:lvlOverride w:ilvl="0">
       <w:lvl w:ilvl="0">
@@ -5667,7 +5873,7 @@
       </w:lvl>
     </w:lvlOverride>
   </w:num>
-  <w:num w:numId="13">
+  <w:num w:numId="13" w16cid:durableId="1106654944">
     <w:abstractNumId w:val="4"/>
     <w:lvlOverride w:ilvl="0">
       <w:lvl w:ilvl="0">
@@ -5677,7 +5883,7 @@
       </w:lvl>
     </w:lvlOverride>
   </w:num>
-  <w:num w:numId="14">
+  <w:num w:numId="14" w16cid:durableId="1232233086">
     <w:abstractNumId w:val="21"/>
     <w:lvlOverride w:ilvl="0">
       <w:lvl w:ilvl="0">
@@ -5687,7 +5893,7 @@
       </w:lvl>
     </w:lvlOverride>
   </w:num>
-  <w:num w:numId="15">
+  <w:num w:numId="15" w16cid:durableId="1529180083">
     <w:abstractNumId w:val="2"/>
     <w:lvlOverride w:ilvl="0">
       <w:lvl w:ilvl="0">
@@ -5697,7 +5903,7 @@
       </w:lvl>
     </w:lvlOverride>
   </w:num>
-  <w:num w:numId="16">
+  <w:num w:numId="16" w16cid:durableId="1536311571">
     <w:abstractNumId w:val="16"/>
     <w:lvlOverride w:ilvl="0">
       <w:lvl w:ilvl="0">
@@ -5707,7 +5913,7 @@
       </w:lvl>
     </w:lvlOverride>
   </w:num>
-  <w:num w:numId="17">
+  <w:num w:numId="17" w16cid:durableId="704792650">
     <w:abstractNumId w:val="11"/>
     <w:lvlOverride w:ilvl="0">
       <w:lvl w:ilvl="0">
@@ -5717,32 +5923,32 @@
       </w:lvl>
     </w:lvlOverride>
   </w:num>
-  <w:num w:numId="18">
+  <w:num w:numId="18" w16cid:durableId="393892134">
     <w:abstractNumId w:val="20"/>
   </w:num>
-  <w:num w:numId="19">
+  <w:num w:numId="19" w16cid:durableId="843862868">
     <w:abstractNumId w:val="1"/>
   </w:num>
-  <w:num w:numId="20">
+  <w:num w:numId="20" w16cid:durableId="106437987">
     <w:abstractNumId w:val="3"/>
   </w:num>
-  <w:num w:numId="21">
+  <w:num w:numId="21" w16cid:durableId="281963730">
     <w:abstractNumId w:val="6"/>
   </w:num>
-  <w:num w:numId="22">
+  <w:num w:numId="22" w16cid:durableId="1111320593">
     <w:abstractNumId w:val="7"/>
   </w:num>
-  <w:num w:numId="23">
+  <w:num w:numId="23" w16cid:durableId="1111364677">
     <w:abstractNumId w:val="0"/>
   </w:num>
-  <w:num w:numId="24">
+  <w:num w:numId="24" w16cid:durableId="519126874">
     <w:abstractNumId w:val="22"/>
   </w:num>
 </w:numbering>
 </file>
 
 <file path=word/styles.xml><?xml version="1.0" encoding="utf-8"?>
-<w:styles xmlns:mc="http://schemas.openxmlformats.org/markup-compatibility/2006" xmlns:r="http://schemas.openxmlformats.org/officeDocument/2006/relationships" xmlns:w="http://schemas.openxmlformats.org/wordprocessingml/2006/main" xmlns:w14="http://schemas.microsoft.com/office/word/2010/wordml" xmlns:w15="http://schemas.microsoft.com/office/word/2012/wordml" xmlns:w16cex="http://schemas.microsoft.com/office/word/2018/wordml/cex" xmlns:w16cid="http://schemas.microsoft.com/office/word/2016/wordml/cid" xmlns:w16="http://schemas.microsoft.com/office/word/2018/wordml" xmlns:w16se="http://schemas.microsoft.com/office/word/2015/wordml/symex" mc:Ignorable="w14 w15 w16se w16cid w16 w16cex">
+<w:styles xmlns:mc="http://schemas.openxmlformats.org/markup-compatibility/2006" xmlns:r="http://schemas.openxmlformats.org/officeDocument/2006/relationships" xmlns:w="http://schemas.openxmlformats.org/wordprocessingml/2006/main" xmlns:w14="http://schemas.microsoft.com/office/word/2010/wordml" xmlns:w15="http://schemas.microsoft.com/office/word/2012/wordml" xmlns:w16cex="http://schemas.microsoft.com/office/word/2018/wordml/cex" xmlns:w16cid="http://schemas.microsoft.com/office/word/2016/wordml/cid" xmlns:w16="http://schemas.microsoft.com/office/word/2018/wordml" xmlns:w16sdtdh="http://schemas.microsoft.com/office/word/2020/wordml/sdtdatahash" xmlns:w16se="http://schemas.microsoft.com/office/word/2015/wordml/symex" mc:Ignorable="w14 w15 w16se w16cid w16 w16cex w16sdtdh">
   <w:docDefaults>
     <w:rPrDefault>
       <w:rPr>
@@ -5909,7 +6115,7 @@
     <w:lsdException w:name="Table Web 2" w:semiHidden="1" w:unhideWhenUsed="1"/>
     <w:lsdException w:name="Table Web 3" w:semiHidden="1" w:unhideWhenUsed="1"/>
     <w:lsdException w:name="Balloon Text" w:semiHidden="1" w:unhideWhenUsed="1"/>
-    <w:lsdException w:name="Table Grid" w:semiHidden="1" w:uiPriority="59" w:unhideWhenUsed="1"/>
+    <w:lsdException w:name="Table Grid" w:uiPriority="59"/>
     <w:lsdException w:name="Table Theme" w:semiHidden="1" w:unhideWhenUsed="1"/>
     <w:lsdException w:name="Placeholder Text" w:semiHidden="1"/>
     <w:lsdException w:name="No Spacing" w:uiPriority="1" w:qFormat="1"/>
@@ -6234,7 +6440,6 @@
   <w:style w:type="character" w:default="1" w:styleId="DefaultParagraphFont">
     <w:name w:val="Default Paragraph Font"/>
     <w:uiPriority w:val="1"/>
-    <w:semiHidden/>
     <w:unhideWhenUsed/>
   </w:style>
   <w:style w:type="table" w:default="1" w:styleId="TableNormal">
@@ -6808,9 +7013,7 @@
 </file>
 
 <file path=customXml/item1.xml><?xml version="1.0" encoding="utf-8"?>
-<go:gDocsCustomXmlDataStorage xmlns:go="http://customooxmlschemas.google.com/" xmlns:r="http://schemas.openxmlformats.org/officeDocument/2006/relationships">
-  <go:docsCustomData xmlns:go="http://customooxmlschemas.google.com/" roundtripDataSignature="AMtx7mipqZx1zn/mklSPU3yK2MzIyI2a9w==">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</go:docsCustomData>
-</go:gDocsCustomXmlDataStorage>
+<b:Sources xmlns:b="http://schemas.openxmlformats.org/officeDocument/2006/bibliography" xmlns="http://schemas.openxmlformats.org/officeDocument/2006/bibliography" SelectedStyle="\APA.XSL" StyleName="APA"/>
 </file>
 
 <file path=customXml/item2.xml><?xml version="1.0" encoding="utf-8"?>
@@ -6818,14 +7021,15 @@
 </file>
 
 <file path=customXml/item3.xml><?xml version="1.0" encoding="utf-8"?>
-<b:Sources xmlns:b="http://schemas.openxmlformats.org/officeDocument/2006/bibliography" xmlns="http://schemas.openxmlformats.org/officeDocument/2006/bibliography" SelectedStyle="\APA.XSL" StyleName="APA"/>
+<go:gDocsCustomXmlDataStorage xmlns:go="http://customooxmlschemas.google.com/" xmlns:r="http://schemas.openxmlformats.org/officeDocument/2006/relationships">
+  <go:docsCustomData xmlns:go="http://customooxmlschemas.google.com/" roundtripDataSignature="AMtx7mipqZx1zn/mklSPU3yK2MzIyI2a9w==">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</go:docsCustomData>
+</go:gDocsCustomXmlDataStorage>
 </file>
 
 <file path=customXml/itemProps1.xml><?xml version="1.0" encoding="utf-8"?>
-<ds:datastoreItem xmlns:ds="http://schemas.openxmlformats.org/officeDocument/2006/customXml" ds:itemID="{11111111-1234-1234-1234-123412341234}">
+<ds:datastoreItem xmlns:ds="http://schemas.openxmlformats.org/officeDocument/2006/customXml" ds:itemID="{5D5C4334-FE62-4A68-A81F-D0C9C458ADD0}">
   <ds:schemaRefs>
-    <ds:schemaRef ds:uri="http://customooxmlschemas.google.com/"/>
-    <ds:schemaRef ds:uri="http://schemas.openxmlformats.org/officeDocument/2006/relationships"/>
+    <ds:schemaRef ds:uri="http://schemas.openxmlformats.org/officeDocument/2006/bibliography"/>
   </ds:schemaRefs>
 </ds:datastoreItem>
 </file>
@@ -6839,9 +7043,10 @@
 </file>
 
 <file path=customXml/itemProps3.xml><?xml version="1.0" encoding="utf-8"?>
-<ds:datastoreItem xmlns:ds="http://schemas.openxmlformats.org/officeDocument/2006/customXml" ds:itemID="{5D5C4334-FE62-4A68-A81F-D0C9C458ADD0}">
+<ds:datastoreItem xmlns:ds="http://schemas.openxmlformats.org/officeDocument/2006/customXml" ds:itemID="{11111111-1234-1234-1234-123412341234}">
   <ds:schemaRefs>
-    <ds:schemaRef ds:uri="http://schemas.openxmlformats.org/officeDocument/2006/bibliography"/>
+    <ds:schemaRef ds:uri="http://customooxmlschemas.google.com/"/>
+    <ds:schemaRef ds:uri="http://schemas.openxmlformats.org/officeDocument/2006/relationships"/>
   </ds:schemaRefs>
 </ds:datastoreItem>
 </file>
</xml_diff>